<commit_message>
New Web Login React form !!
</commit_message>
<xml_diff>
--- a/Documentations/A2CDevLogbook.docx
+++ b/Documentations/A2CDevLogbook.docx
@@ -7377,21 +7377,51 @@
       <w:pPr>
         <w:spacing w:after="0"/>
         <w:ind w:firstLine="90"/>
+      </w:pPr>
+      <w:r>
         <w:rPr>
           <w:rFonts w:hint="eastAsia"/>
         </w:rPr>
-      </w:pPr>
+        <w:t>├──</w:t>
+      </w:r>
       <w:r>
         <w:rPr>
           <w:rFonts w:hint="eastAsia"/>
         </w:rPr>
+        <w:t xml:space="preserve"> Client/ </w:t>
+      </w:r>
+      <w:r>
+        <w:tab/>
+      </w:r>
+      <w:r>
+        <w:tab/>
+      </w:r>
+      <w:r>
+        <w:tab/>
+      </w:r>
+      <w:r>
+        <w:rPr>
+          <w:rFonts w:hint="eastAsia"/>
+        </w:rPr>
+        <w:t xml:space="preserve"># React frontend </w:t>
+      </w:r>
+    </w:p>
+    <w:p>
+      <w:pPr>
+        <w:spacing w:after="0"/>
+        <w:ind w:firstLine="90"/>
+      </w:pPr>
+      <w:r>
+        <w:rPr>
+          <w:rFonts w:hint="eastAsia"/>
+        </w:rPr>
         <w:t>├──</w:t>
       </w:r>
       <w:r>
         <w:rPr>
           <w:rFonts w:hint="eastAsia"/>
         </w:rPr>
-        <w:t xml:space="preserve"> Client/ </w:t>
+        <w:t xml:space="preserve"> Documentation/ </w:t>
       </w:r>
       <w:r>
         <w:tab/>
@@ -7400,34 +7430,94 @@
         <w:tab/>
       </w:r>
       <w:r>
+        <w:rPr>
+          <w:rFonts w:hint="eastAsia"/>
+        </w:rPr>
+        <w:t xml:space="preserve"># SRS, SDD, diagrams, and more </w:t>
+      </w:r>
+    </w:p>
+    <w:p>
+      <w:pPr>
+        <w:spacing w:after="0"/>
+        <w:ind w:firstLine="90"/>
+      </w:pPr>
+      <w:r>
+        <w:rPr>
+          <w:rFonts w:hint="eastAsia"/>
+        </w:rPr>
+        <w:t>├──</w:t>
+      </w:r>
+      <w:r>
+        <w:rPr>
+          <w:rFonts w:hint="eastAsia"/>
+        </w:rPr>
+        <w:t xml:space="preserve"> Shared/ </w:t>
+      </w:r>
+      <w:r>
         <w:tab/>
       </w:r>
       <w:r>
+        <w:tab/>
+      </w:r>
+      <w:r>
+        <w:tab/>
+      </w:r>
+      <w:r>
         <w:rPr>
           <w:rFonts w:hint="eastAsia"/>
         </w:rPr>
-        <w:t xml:space="preserve"># React frontend </w:t>
+        <w:t xml:space="preserve"># Common code (DTOs, Utils, etc.) </w:t>
       </w:r>
     </w:p>
     <w:p>
       <w:pPr>
         <w:spacing w:after="0"/>
         <w:ind w:firstLine="90"/>
+      </w:pPr>
+      <w:r>
         <w:rPr>
           <w:rFonts w:hint="eastAsia"/>
         </w:rPr>
-      </w:pPr>
+        <w:t>├──</w:t>
+      </w:r>
       <w:r>
         <w:rPr>
           <w:rFonts w:hint="eastAsia"/>
         </w:rPr>
+        <w:t xml:space="preserve"> Tests/ </w:t>
+      </w:r>
+      <w:r>
+        <w:tab/>
+      </w:r>
+      <w:r>
+        <w:tab/>
+      </w:r>
+      <w:r>
+        <w:tab/>
+      </w:r>
+      <w:r>
+        <w:rPr>
+          <w:rFonts w:hint="eastAsia"/>
+        </w:rPr>
+        <w:t xml:space="preserve"># Unit and integration tests per service </w:t>
+      </w:r>
+    </w:p>
+    <w:p>
+      <w:pPr>
+        <w:spacing w:after="0"/>
+        <w:ind w:firstLine="90"/>
+      </w:pPr>
+      <w:r>
+        <w:rPr>
+          <w:rFonts w:hint="eastAsia"/>
+        </w:rPr>
         <w:t>├──</w:t>
       </w:r>
       <w:r>
         <w:rPr>
           <w:rFonts w:hint="eastAsia"/>
         </w:rPr>
-        <w:t xml:space="preserve"> Documentation/ </w:t>
+        <w:t xml:space="preserve"> Server/ </w:t>
       </w:r>
       <w:r>
         <w:tab/>
@@ -7436,132 +7526,200 @@
         <w:tab/>
       </w:r>
       <w:r>
+        <w:tab/>
+      </w:r>
+      <w:r>
         <w:rPr>
           <w:rFonts w:hint="eastAsia"/>
         </w:rPr>
-        <w:t xml:space="preserve"># SRS, SDD, diagrams, and more </w:t>
+        <w:t xml:space="preserve"># Microservices backend </w:t>
       </w:r>
     </w:p>
     <w:p>
       <w:pPr>
         <w:spacing w:after="0"/>
         <w:ind w:firstLine="90"/>
+      </w:pPr>
+      <w:r>
         <w:rPr>
           <w:rFonts w:hint="eastAsia"/>
         </w:rPr>
-      </w:pPr>
+        <w:t>│</w:t>
+      </w:r>
       <w:r>
         <w:rPr>
           <w:rFonts w:hint="eastAsia"/>
         </w:rPr>
+        <w:t xml:space="preserve"> </w:t>
+      </w:r>
+      <w:r>
+        <w:rPr>
+          <w:rFonts w:hint="eastAsia"/>
+        </w:rPr>
         <w:t>├──</w:t>
       </w:r>
       <w:r>
         <w:rPr>
           <w:rFonts w:hint="eastAsia"/>
         </w:rPr>
-        <w:t xml:space="preserve"> Shared/ </w:t>
-      </w:r>
-      <w:r>
-        <w:tab/>
-      </w:r>
-      <w:r>
-        <w:tab/>
-      </w:r>
-      <w:r>
-        <w:tab/>
-      </w:r>
+        <w:t xml:space="preserve"> </w:t>
+      </w:r>
+      <w:proofErr w:type="spellStart"/>
       <w:r>
         <w:rPr>
           <w:rFonts w:hint="eastAsia"/>
         </w:rPr>
-        <w:t xml:space="preserve"># Common code (DTOs, Utils, etc.) </w:t>
+        <w:t>AuthService</w:t>
+      </w:r>
+      <w:proofErr w:type="spellEnd"/>
+      <w:r>
+        <w:rPr>
+          <w:rFonts w:hint="eastAsia"/>
+        </w:rPr>
+        <w:t xml:space="preserve">/ </w:t>
       </w:r>
     </w:p>
     <w:p>
       <w:pPr>
         <w:spacing w:after="0"/>
         <w:ind w:firstLine="90"/>
+      </w:pPr>
+      <w:r>
         <w:rPr>
           <w:rFonts w:hint="eastAsia"/>
         </w:rPr>
-      </w:pPr>
+        <w:t>│</w:t>
+      </w:r>
       <w:r>
         <w:rPr>
           <w:rFonts w:hint="eastAsia"/>
         </w:rPr>
+        <w:t xml:space="preserve"> </w:t>
+      </w:r>
+      <w:r>
+        <w:rPr>
+          <w:rFonts w:hint="eastAsia"/>
+        </w:rPr>
         <w:t>├──</w:t>
       </w:r>
       <w:r>
         <w:rPr>
           <w:rFonts w:hint="eastAsia"/>
         </w:rPr>
-        <w:t xml:space="preserve"> Tests/ </w:t>
-      </w:r>
-      <w:r>
-        <w:tab/>
-      </w:r>
-      <w:r>
-        <w:tab/>
-      </w:r>
-      <w:r>
-        <w:tab/>
-      </w:r>
+        <w:t xml:space="preserve"> </w:t>
+      </w:r>
+      <w:proofErr w:type="spellStart"/>
       <w:r>
         <w:rPr>
           <w:rFonts w:hint="eastAsia"/>
         </w:rPr>
-        <w:t xml:space="preserve"># Unit and integration tests per service </w:t>
+        <w:t>CustomersService</w:t>
+      </w:r>
+      <w:proofErr w:type="spellEnd"/>
+      <w:r>
+        <w:rPr>
+          <w:rFonts w:hint="eastAsia"/>
+        </w:rPr>
+        <w:t xml:space="preserve">/ </w:t>
       </w:r>
     </w:p>
     <w:p>
       <w:pPr>
         <w:spacing w:after="0"/>
         <w:ind w:firstLine="90"/>
+      </w:pPr>
+      <w:r>
         <w:rPr>
           <w:rFonts w:hint="eastAsia"/>
         </w:rPr>
-      </w:pPr>
+        <w:t>│</w:t>
+      </w:r>
       <w:r>
         <w:rPr>
           <w:rFonts w:hint="eastAsia"/>
         </w:rPr>
+        <w:t xml:space="preserve"> </w:t>
+      </w:r>
+      <w:r>
+        <w:rPr>
+          <w:rFonts w:hint="eastAsia"/>
+        </w:rPr>
         <w:t>├──</w:t>
       </w:r>
       <w:r>
         <w:rPr>
           <w:rFonts w:hint="eastAsia"/>
         </w:rPr>
-        <w:t xml:space="preserve"> Server/ </w:t>
-      </w:r>
-      <w:r>
-        <w:tab/>
-      </w:r>
-      <w:r>
-        <w:tab/>
-      </w:r>
-      <w:r>
-        <w:tab/>
-      </w:r>
+        <w:t xml:space="preserve"> </w:t>
+      </w:r>
+      <w:proofErr w:type="spellStart"/>
       <w:r>
         <w:rPr>
           <w:rFonts w:hint="eastAsia"/>
         </w:rPr>
-        <w:t xml:space="preserve"># Microservices backend </w:t>
+        <w:t>OrdersService</w:t>
+      </w:r>
+      <w:proofErr w:type="spellEnd"/>
+      <w:r>
+        <w:rPr>
+          <w:rFonts w:hint="eastAsia"/>
+        </w:rPr>
+        <w:t xml:space="preserve">/ </w:t>
       </w:r>
     </w:p>
     <w:p>
       <w:pPr>
         <w:spacing w:after="0"/>
         <w:ind w:firstLine="90"/>
+      </w:pPr>
+      <w:r>
         <w:rPr>
           <w:rFonts w:hint="eastAsia"/>
         </w:rPr>
-      </w:pPr>
+        <w:t>│</w:t>
+      </w:r>
       <w:r>
         <w:rPr>
           <w:rFonts w:hint="eastAsia"/>
         </w:rPr>
+        <w:t xml:space="preserve"> </w:t>
+      </w:r>
+      <w:r>
+        <w:rPr>
+          <w:rFonts w:hint="eastAsia"/>
+        </w:rPr>
+        <w:t>├──</w:t>
+      </w:r>
+      <w:r>
+        <w:rPr>
+          <w:rFonts w:hint="eastAsia"/>
+        </w:rPr>
+        <w:t xml:space="preserve"> </w:t>
+      </w:r>
+      <w:proofErr w:type="spellStart"/>
+      <w:r>
+        <w:rPr>
+          <w:rFonts w:hint="eastAsia"/>
+        </w:rPr>
+        <w:t>LoggingService</w:t>
+      </w:r>
+      <w:proofErr w:type="spellEnd"/>
+      <w:r>
+        <w:rPr>
+          <w:rFonts w:hint="eastAsia"/>
+        </w:rPr>
+        <w:t xml:space="preserve">/ </w:t>
+      </w:r>
+    </w:p>
+    <w:p>
+      <w:pPr>
+        <w:spacing w:after="0"/>
+        <w:ind w:firstLine="90"/>
+      </w:pPr>
+      <w:r>
+        <w:rPr>
+          <w:rFonts w:hint="eastAsia"/>
+        </w:rPr>
         <w:t>│</w:t>
       </w:r>
       <w:r>
@@ -7587,7 +7745,7 @@
         <w:rPr>
           <w:rFonts w:hint="eastAsia"/>
         </w:rPr>
-        <w:t>AuthService</w:t>
+        <w:t>NotificationsWorker</w:t>
       </w:r>
       <w:proofErr w:type="spellEnd"/>
       <w:r>
@@ -7601,197 +7759,6 @@
       <w:pPr>
         <w:spacing w:after="0"/>
         <w:ind w:firstLine="90"/>
-        <w:rPr>
-          <w:rFonts w:hint="eastAsia"/>
-        </w:rPr>
-      </w:pPr>
-      <w:r>
-        <w:rPr>
-          <w:rFonts w:hint="eastAsia"/>
-        </w:rPr>
-        <w:t>│</w:t>
-      </w:r>
-      <w:r>
-        <w:rPr>
-          <w:rFonts w:hint="eastAsia"/>
-        </w:rPr>
-        <w:t xml:space="preserve"> </w:t>
-      </w:r>
-      <w:r>
-        <w:rPr>
-          <w:rFonts w:hint="eastAsia"/>
-        </w:rPr>
-        <w:t>├──</w:t>
-      </w:r>
-      <w:r>
-        <w:rPr>
-          <w:rFonts w:hint="eastAsia"/>
-        </w:rPr>
-        <w:t xml:space="preserve"> </w:t>
-      </w:r>
-      <w:proofErr w:type="spellStart"/>
-      <w:r>
-        <w:rPr>
-          <w:rFonts w:hint="eastAsia"/>
-        </w:rPr>
-        <w:t>CustomersService</w:t>
-      </w:r>
-      <w:proofErr w:type="spellEnd"/>
-      <w:r>
-        <w:rPr>
-          <w:rFonts w:hint="eastAsia"/>
-        </w:rPr>
-        <w:t xml:space="preserve">/ </w:t>
-      </w:r>
-    </w:p>
-    <w:p>
-      <w:pPr>
-        <w:spacing w:after="0"/>
-        <w:ind w:firstLine="90"/>
-        <w:rPr>
-          <w:rFonts w:hint="eastAsia"/>
-        </w:rPr>
-      </w:pPr>
-      <w:r>
-        <w:rPr>
-          <w:rFonts w:hint="eastAsia"/>
-        </w:rPr>
-        <w:t>│</w:t>
-      </w:r>
-      <w:r>
-        <w:rPr>
-          <w:rFonts w:hint="eastAsia"/>
-        </w:rPr>
-        <w:t xml:space="preserve"> </w:t>
-      </w:r>
-      <w:r>
-        <w:rPr>
-          <w:rFonts w:hint="eastAsia"/>
-        </w:rPr>
-        <w:t>├──</w:t>
-      </w:r>
-      <w:r>
-        <w:rPr>
-          <w:rFonts w:hint="eastAsia"/>
-        </w:rPr>
-        <w:t xml:space="preserve"> </w:t>
-      </w:r>
-      <w:proofErr w:type="spellStart"/>
-      <w:r>
-        <w:rPr>
-          <w:rFonts w:hint="eastAsia"/>
-        </w:rPr>
-        <w:t>OrdersService</w:t>
-      </w:r>
-      <w:proofErr w:type="spellEnd"/>
-      <w:r>
-        <w:rPr>
-          <w:rFonts w:hint="eastAsia"/>
-        </w:rPr>
-        <w:t xml:space="preserve">/ </w:t>
-      </w:r>
-    </w:p>
-    <w:p>
-      <w:pPr>
-        <w:spacing w:after="0"/>
-        <w:ind w:firstLine="90"/>
-        <w:rPr>
-          <w:rFonts w:hint="eastAsia"/>
-        </w:rPr>
-      </w:pPr>
-      <w:r>
-        <w:rPr>
-          <w:rFonts w:hint="eastAsia"/>
-        </w:rPr>
-        <w:t>│</w:t>
-      </w:r>
-      <w:r>
-        <w:rPr>
-          <w:rFonts w:hint="eastAsia"/>
-        </w:rPr>
-        <w:t xml:space="preserve"> </w:t>
-      </w:r>
-      <w:r>
-        <w:rPr>
-          <w:rFonts w:hint="eastAsia"/>
-        </w:rPr>
-        <w:t>├──</w:t>
-      </w:r>
-      <w:r>
-        <w:rPr>
-          <w:rFonts w:hint="eastAsia"/>
-        </w:rPr>
-        <w:t xml:space="preserve"> </w:t>
-      </w:r>
-      <w:proofErr w:type="spellStart"/>
-      <w:r>
-        <w:rPr>
-          <w:rFonts w:hint="eastAsia"/>
-        </w:rPr>
-        <w:t>LoggingService</w:t>
-      </w:r>
-      <w:proofErr w:type="spellEnd"/>
-      <w:r>
-        <w:rPr>
-          <w:rFonts w:hint="eastAsia"/>
-        </w:rPr>
-        <w:t xml:space="preserve">/ </w:t>
-      </w:r>
-    </w:p>
-    <w:p>
-      <w:pPr>
-        <w:spacing w:after="0"/>
-        <w:ind w:firstLine="90"/>
-        <w:rPr>
-          <w:rFonts w:hint="eastAsia"/>
-        </w:rPr>
-      </w:pPr>
-      <w:r>
-        <w:rPr>
-          <w:rFonts w:hint="eastAsia"/>
-        </w:rPr>
-        <w:t>│</w:t>
-      </w:r>
-      <w:r>
-        <w:rPr>
-          <w:rFonts w:hint="eastAsia"/>
-        </w:rPr>
-        <w:t xml:space="preserve"> </w:t>
-      </w:r>
-      <w:r>
-        <w:rPr>
-          <w:rFonts w:hint="eastAsia"/>
-        </w:rPr>
-        <w:t>├──</w:t>
-      </w:r>
-      <w:r>
-        <w:rPr>
-          <w:rFonts w:hint="eastAsia"/>
-        </w:rPr>
-        <w:t xml:space="preserve"> </w:t>
-      </w:r>
-      <w:proofErr w:type="spellStart"/>
-      <w:r>
-        <w:rPr>
-          <w:rFonts w:hint="eastAsia"/>
-        </w:rPr>
-        <w:t>NotificationsWorker</w:t>
-      </w:r>
-      <w:proofErr w:type="spellEnd"/>
-      <w:r>
-        <w:rPr>
-          <w:rFonts w:hint="eastAsia"/>
-        </w:rPr>
-        <w:t xml:space="preserve">/ </w:t>
-      </w:r>
-    </w:p>
-    <w:p>
-      <w:pPr>
-        <w:spacing w:after="0"/>
-        <w:ind w:firstLine="90"/>
-        <w:rPr>
-          <w:rFonts w:hint="eastAsia"/>
-        </w:rPr>
       </w:pPr>
       <w:r>
         <w:rPr>
@@ -7837,120 +7804,1190 @@
       <w:pPr>
         <w:spacing w:after="0"/>
         <w:ind w:firstLine="90"/>
+      </w:pPr>
+      <w:r>
         <w:rPr>
           <w:rFonts w:hint="eastAsia"/>
         </w:rPr>
-      </w:pPr>
+        <w:t>│</w:t>
+      </w:r>
       <w:r>
         <w:rPr>
           <w:rFonts w:hint="eastAsia"/>
         </w:rPr>
-        <w:t>│</w:t>
+        <w:t xml:space="preserve"> </w:t>
       </w:r>
       <w:r>
         <w:rPr>
           <w:rFonts w:hint="eastAsia"/>
         </w:rPr>
+        <w:t>└──</w:t>
+      </w:r>
+      <w:r>
+        <w:rPr>
+          <w:rFonts w:hint="eastAsia"/>
+        </w:rPr>
+        <w:t xml:space="preserve"> Gateway/ </w:t>
+      </w:r>
+    </w:p>
+    <w:p>
+      <w:pPr>
+        <w:spacing w:after="0"/>
+        <w:ind w:firstLine="90"/>
+      </w:pPr>
+      <w:r>
+        <w:rPr>
+          <w:rFonts w:hint="eastAsia"/>
+        </w:rPr>
+        <w:t>├──</w:t>
+      </w:r>
+      <w:r>
+        <w:rPr>
+          <w:rFonts w:hint="eastAsia"/>
+        </w:rPr>
+        <w:t xml:space="preserve"> A2C.sln </w:t>
+      </w:r>
+      <w:r>
+        <w:tab/>
+      </w:r>
+      <w:r>
+        <w:tab/>
+      </w:r>
+      <w:r>
+        <w:tab/>
+      </w:r>
+      <w:r>
+        <w:rPr>
+          <w:rFonts w:hint="eastAsia"/>
+        </w:rPr>
+        <w:t xml:space="preserve"># Main solution file </w:t>
+      </w:r>
+    </w:p>
+    <w:p>
+      <w:pPr>
+        <w:spacing w:after="0"/>
+        <w:ind w:firstLine="90"/>
+      </w:pPr>
+      <w:r>
+        <w:rPr>
+          <w:rFonts w:hint="eastAsia"/>
+        </w:rPr>
+        <w:t>└──</w:t>
+      </w:r>
+      <w:r>
+        <w:rPr>
+          <w:rFonts w:hint="eastAsia"/>
+        </w:rPr>
+        <w:t xml:space="preserve"> docker-</w:t>
+      </w:r>
+      <w:proofErr w:type="spellStart"/>
+      <w:r>
+        <w:rPr>
+          <w:rFonts w:hint="eastAsia"/>
+        </w:rPr>
+        <w:t>compose.yml</w:t>
+      </w:r>
+      <w:proofErr w:type="spellEnd"/>
+      <w:r>
+        <w:rPr>
+          <w:rFonts w:hint="eastAsia"/>
+        </w:rPr>
         <w:t xml:space="preserve"> </w:t>
       </w:r>
       <w:r>
+        <w:tab/>
+      </w:r>
+      <w:r>
+        <w:tab/>
+      </w:r>
+      <w:r>
         <w:rPr>
           <w:rFonts w:hint="eastAsia"/>
         </w:rPr>
-        <w:t>└──</w:t>
-      </w:r>
-      <w:r>
-        <w:rPr>
-          <w:rFonts w:hint="eastAsia"/>
-        </w:rPr>
-        <w:t xml:space="preserve"> Gateway/ </w:t>
-      </w:r>
-    </w:p>
-    <w:p>
-      <w:pPr>
-        <w:spacing w:after="0"/>
-        <w:ind w:firstLine="90"/>
-        <w:rPr>
-          <w:rFonts w:hint="eastAsia"/>
-        </w:rPr>
-      </w:pPr>
-      <w:r>
-        <w:rPr>
-          <w:rFonts w:hint="eastAsia"/>
-        </w:rPr>
-        <w:t>├──</w:t>
-      </w:r>
-      <w:r>
-        <w:rPr>
-          <w:rFonts w:hint="eastAsia"/>
-        </w:rPr>
-        <w:t xml:space="preserve"> A2C.sln </w:t>
-      </w:r>
-      <w:r>
-        <w:tab/>
-      </w:r>
-      <w:r>
-        <w:tab/>
-      </w:r>
-      <w:r>
-        <w:tab/>
-      </w:r>
-      <w:r>
-        <w:rPr>
-          <w:rFonts w:hint="eastAsia"/>
-        </w:rPr>
-        <w:t xml:space="preserve"># Main solution file </w:t>
-      </w:r>
-    </w:p>
-    <w:p>
-      <w:pPr>
-        <w:spacing w:after="0"/>
-        <w:ind w:firstLine="90"/>
-      </w:pPr>
-      <w:r>
-        <w:rPr>
-          <w:rFonts w:hint="eastAsia"/>
-        </w:rPr>
-        <w:t>└──</w:t>
-      </w:r>
-      <w:r>
-        <w:rPr>
-          <w:rFonts w:hint="eastAsia"/>
-        </w:rPr>
-        <w:t xml:space="preserve"> docker-</w:t>
-      </w:r>
-      <w:proofErr w:type="spellStart"/>
-      <w:r>
-        <w:rPr>
-          <w:rFonts w:hint="eastAsia"/>
-        </w:rPr>
-        <w:t>compose.yml</w:t>
-      </w:r>
-      <w:proofErr w:type="spellEnd"/>
-      <w:r>
-        <w:rPr>
-          <w:rFonts w:hint="eastAsia"/>
+        <w:t># Docker setup for all services</w:t>
+      </w:r>
+    </w:p>
+    <w:p>
+      <w:pPr>
+        <w:bidi/>
+        <w:rPr>
+          <w:lang w:val="en-IL"/>
+        </w:rPr>
+      </w:pPr>
+      <w:r>
+        <w:rPr>
+          <w:rFonts w:hint="cs"/>
+          <w:rtl/>
+        </w:rPr>
+        <w:t>17.8.25</w:t>
+      </w:r>
+      <w:r>
+        <w:rPr>
+          <w:rtl/>
+        </w:rPr>
+        <w:br/>
+      </w:r>
+      <w:r>
+        <w:rPr>
+          <w:rtl/>
+        </w:rPr>
+        <w:t xml:space="preserve">ההבדל העיקרי בין הקונטיינרים </w:t>
+      </w:r>
+      <w:r>
+        <w:rPr>
+          <w:lang w:val="en-IL"/>
+        </w:rPr>
+        <w:t xml:space="preserve">a2c-api </w:t>
+      </w:r>
+      <w:r>
+        <w:rPr>
+          <w:rtl/>
+        </w:rPr>
+        <w:t>ו־</w:t>
+      </w:r>
+      <w:proofErr w:type="spellStart"/>
+      <w:r>
+        <w:rPr>
+          <w:lang w:val="en-IL"/>
+        </w:rPr>
+        <w:t>authservice:dev</w:t>
+      </w:r>
+      <w:proofErr w:type="spellEnd"/>
+      <w:r>
+        <w:rPr>
+          <w:lang w:val="en-IL"/>
         </w:rPr>
         <w:t xml:space="preserve"> </w:t>
       </w:r>
       <w:r>
-        <w:tab/>
-      </w:r>
-      <w:r>
-        <w:tab/>
-      </w:r>
-      <w:r>
-        <w:rPr>
-          <w:rFonts w:hint="eastAsia"/>
-        </w:rPr>
-        <w:t># Docker setup for all services</w:t>
-      </w:r>
-    </w:p>
+        <w:rPr>
+          <w:rtl/>
+        </w:rPr>
+        <w:t xml:space="preserve">הוא </w:t>
+      </w:r>
+      <w:r>
+        <w:rPr>
+          <w:b/>
+          <w:bCs/>
+          <w:rtl/>
+        </w:rPr>
+        <w:t>השם של התמונה</w:t>
+      </w:r>
+      <w:r>
+        <w:rPr>
+          <w:b/>
+          <w:bCs/>
+          <w:lang w:val="en-IL"/>
+        </w:rPr>
+        <w:t xml:space="preserve"> (image) </w:t>
+      </w:r>
+      <w:r>
+        <w:rPr>
+          <w:b/>
+          <w:bCs/>
+          <w:rtl/>
+        </w:rPr>
+        <w:t>והסביבה שבה הם נבנו</w:t>
+      </w:r>
+      <w:r>
+        <w:rPr>
+          <w:lang w:val="en-IL"/>
+        </w:rPr>
+        <w:t>:</w:t>
+      </w:r>
+    </w:p>
+    <w:tbl>
+      <w:tblPr>
+        <w:tblW w:w="0" w:type="auto"/>
+        <w:tblCellSpacing w:w="15" w:type="dxa"/>
+        <w:tblCellMar>
+          <w:top w:w="15" w:type="dxa"/>
+          <w:left w:w="15" w:type="dxa"/>
+          <w:bottom w:w="15" w:type="dxa"/>
+          <w:right w:w="15" w:type="dxa"/>
+        </w:tblCellMar>
+        <w:tblLook w:val="04A0" w:firstRow="1" w:lastRow="0" w:firstColumn="1" w:lastColumn="0" w:noHBand="0" w:noVBand="1"/>
+      </w:tblPr>
+      <w:tblGrid>
+        <w:gridCol w:w="1247"/>
+        <w:gridCol w:w="3008"/>
+        <w:gridCol w:w="4771"/>
+      </w:tblGrid>
+      <w:tr>
+        <w:trPr>
+          <w:tblHeader/>
+          <w:tblCellSpacing w:w="15" w:type="dxa"/>
+        </w:trPr>
+        <w:tc>
+          <w:tcPr>
+            <w:tcW w:w="0" w:type="auto"/>
+            <w:vAlign w:val="center"/>
+            <w:hideMark/>
+          </w:tcPr>
+          <w:p>
+            <w:pPr>
+              <w:bidi/>
+              <w:rPr>
+                <w:b/>
+                <w:bCs/>
+                <w:lang w:val="en-IL"/>
+              </w:rPr>
+            </w:pPr>
+            <w:r>
+              <w:rPr>
+                <w:b/>
+                <w:bCs/>
+                <w:rtl/>
+              </w:rPr>
+              <w:t>פרמטר</w:t>
+            </w:r>
+          </w:p>
+        </w:tc>
+        <w:tc>
+          <w:tcPr>
+            <w:tcW w:w="0" w:type="auto"/>
+            <w:vAlign w:val="center"/>
+            <w:hideMark/>
+          </w:tcPr>
+          <w:p>
+            <w:pPr>
+              <w:bidi/>
+              <w:rPr>
+                <w:b/>
+                <w:bCs/>
+                <w:lang w:val="en-IL"/>
+              </w:rPr>
+            </w:pPr>
+            <w:r>
+              <w:rPr>
+                <w:b/>
+                <w:bCs/>
+                <w:lang w:val="en-IL"/>
+              </w:rPr>
+              <w:t>a2c-api</w:t>
+            </w:r>
+          </w:p>
+        </w:tc>
+        <w:tc>
+          <w:tcPr>
+            <w:tcW w:w="0" w:type="auto"/>
+            <w:vAlign w:val="center"/>
+            <w:hideMark/>
+          </w:tcPr>
+          <w:p>
+            <w:pPr>
+              <w:bidi/>
+              <w:rPr>
+                <w:b/>
+                <w:bCs/>
+                <w:lang w:val="en-IL"/>
+              </w:rPr>
+            </w:pPr>
+            <w:proofErr w:type="spellStart"/>
+            <w:proofErr w:type="gramStart"/>
+            <w:r>
+              <w:rPr>
+                <w:b/>
+                <w:bCs/>
+                <w:lang w:val="en-IL"/>
+              </w:rPr>
+              <w:t>authservice:dev</w:t>
+            </w:r>
+            <w:proofErr w:type="spellEnd"/>
+            <w:proofErr w:type="gramEnd"/>
+          </w:p>
+        </w:tc>
+      </w:tr>
+      <w:tr>
+        <w:trPr>
+          <w:tblCellSpacing w:w="15" w:type="dxa"/>
+        </w:trPr>
+        <w:tc>
+          <w:tcPr>
+            <w:tcW w:w="0" w:type="auto"/>
+            <w:vAlign w:val="center"/>
+            <w:hideMark/>
+          </w:tcPr>
+          <w:p>
+            <w:pPr>
+              <w:bidi/>
+              <w:rPr>
+                <w:lang w:val="en-IL"/>
+              </w:rPr>
+            </w:pPr>
+            <w:r>
+              <w:rPr>
+                <w:lang w:val="en-IL"/>
+              </w:rPr>
+              <w:t>Image</w:t>
+            </w:r>
+          </w:p>
+        </w:tc>
+        <w:tc>
+          <w:tcPr>
+            <w:tcW w:w="0" w:type="auto"/>
+            <w:vAlign w:val="center"/>
+            <w:hideMark/>
+          </w:tcPr>
+          <w:p>
+            <w:pPr>
+              <w:bidi/>
+              <w:rPr>
+                <w:lang w:val="en-IL"/>
+              </w:rPr>
+            </w:pPr>
+            <w:r>
+              <w:rPr>
+                <w:lang w:val="en-IL"/>
+              </w:rPr>
+              <w:t>a2c-api (</w:t>
+            </w:r>
+            <w:r>
+              <w:rPr>
+                <w:rtl/>
+              </w:rPr>
+              <w:t xml:space="preserve">נבנה דרך </w:t>
+            </w:r>
+            <w:r>
+              <w:rPr>
+                <w:lang w:val="en-IL"/>
+              </w:rPr>
+              <w:t>docker-compose build)</w:t>
+            </w:r>
+          </w:p>
+        </w:tc>
+        <w:tc>
+          <w:tcPr>
+            <w:tcW w:w="0" w:type="auto"/>
+            <w:vAlign w:val="center"/>
+            <w:hideMark/>
+          </w:tcPr>
+          <w:p>
+            <w:pPr>
+              <w:bidi/>
+              <w:rPr>
+                <w:lang w:val="en-IL"/>
+              </w:rPr>
+            </w:pPr>
+            <w:proofErr w:type="spellStart"/>
+            <w:proofErr w:type="gramStart"/>
+            <w:r>
+              <w:rPr>
+                <w:lang w:val="en-IL"/>
+              </w:rPr>
+              <w:t>authservice:dev</w:t>
+            </w:r>
+            <w:proofErr w:type="spellEnd"/>
+            <w:proofErr w:type="gramEnd"/>
+            <w:r>
+              <w:rPr>
+                <w:lang w:val="en-IL"/>
+              </w:rPr>
+              <w:t xml:space="preserve"> (</w:t>
+            </w:r>
+            <w:r>
+              <w:rPr>
+                <w:rtl/>
+              </w:rPr>
+              <w:t xml:space="preserve">נבנה ידנית או דרך פקודת </w:t>
+            </w:r>
+            <w:r>
+              <w:rPr>
+                <w:lang w:val="en-IL"/>
+              </w:rPr>
+              <w:t xml:space="preserve">docker build -t </w:t>
+            </w:r>
+            <w:proofErr w:type="spellStart"/>
+            <w:proofErr w:type="gramStart"/>
+            <w:r>
+              <w:rPr>
+                <w:lang w:val="en-IL"/>
+              </w:rPr>
+              <w:t>authservice:dev</w:t>
+            </w:r>
+            <w:proofErr w:type="spellEnd"/>
+            <w:proofErr w:type="gramEnd"/>
+            <w:r>
+              <w:rPr>
+                <w:lang w:val="en-IL"/>
+              </w:rPr>
+              <w:t>)</w:t>
+            </w:r>
+          </w:p>
+        </w:tc>
+      </w:tr>
+      <w:tr>
+        <w:trPr>
+          <w:tblCellSpacing w:w="15" w:type="dxa"/>
+        </w:trPr>
+        <w:tc>
+          <w:tcPr>
+            <w:tcW w:w="0" w:type="auto"/>
+            <w:vAlign w:val="center"/>
+            <w:hideMark/>
+          </w:tcPr>
+          <w:p>
+            <w:pPr>
+              <w:bidi/>
+              <w:rPr>
+                <w:lang w:val="en-IL"/>
+              </w:rPr>
+            </w:pPr>
+            <w:r>
+              <w:rPr>
+                <w:rtl/>
+              </w:rPr>
+              <w:t>פקודת הרצה</w:t>
+            </w:r>
+          </w:p>
+        </w:tc>
+        <w:tc>
+          <w:tcPr>
+            <w:tcW w:w="0" w:type="auto"/>
+            <w:vAlign w:val="center"/>
+            <w:hideMark/>
+          </w:tcPr>
+          <w:p>
+            <w:pPr>
+              <w:bidi/>
+              <w:rPr>
+                <w:lang w:val="en-IL"/>
+              </w:rPr>
+            </w:pPr>
+            <w:r>
+              <w:rPr>
+                <w:lang w:val="en-IL"/>
+              </w:rPr>
+              <w:t>dotnet AuthService.dll</w:t>
+            </w:r>
+          </w:p>
+        </w:tc>
+        <w:tc>
+          <w:tcPr>
+            <w:tcW w:w="0" w:type="auto"/>
+            <w:vAlign w:val="center"/>
+            <w:hideMark/>
+          </w:tcPr>
+          <w:p>
+            <w:pPr>
+              <w:bidi/>
+              <w:rPr>
+                <w:lang w:val="en-IL"/>
+              </w:rPr>
+            </w:pPr>
+            <w:r>
+              <w:rPr>
+                <w:lang w:val="en-IL"/>
+              </w:rPr>
+              <w:t>dotnet --roll-forward Major AuthService.dll</w:t>
+            </w:r>
+          </w:p>
+        </w:tc>
+      </w:tr>
+      <w:tr>
+        <w:trPr>
+          <w:tblCellSpacing w:w="15" w:type="dxa"/>
+        </w:trPr>
+        <w:tc>
+          <w:tcPr>
+            <w:tcW w:w="0" w:type="auto"/>
+            <w:vAlign w:val="center"/>
+            <w:hideMark/>
+          </w:tcPr>
+          <w:p>
+            <w:pPr>
+              <w:bidi/>
+              <w:rPr>
+                <w:lang w:val="en-IL"/>
+              </w:rPr>
+            </w:pPr>
+            <w:r>
+              <w:rPr>
+                <w:rtl/>
+              </w:rPr>
+              <w:t>פורטים מפורסים</w:t>
+            </w:r>
+          </w:p>
+        </w:tc>
+        <w:tc>
+          <w:tcPr>
+            <w:tcW w:w="0" w:type="auto"/>
+            <w:vAlign w:val="center"/>
+            <w:hideMark/>
+          </w:tcPr>
+          <w:p>
+            <w:pPr>
+              <w:bidi/>
+              <w:rPr>
+                <w:lang w:val="en-IL"/>
+              </w:rPr>
+            </w:pPr>
+            <w:r>
+              <w:rPr>
+                <w:lang w:val="en-IL"/>
+              </w:rPr>
+              <w:t>8080-&gt;80</w:t>
+            </w:r>
+          </w:p>
+        </w:tc>
+        <w:tc>
+          <w:tcPr>
+            <w:tcW w:w="0" w:type="auto"/>
+            <w:vAlign w:val="center"/>
+            <w:hideMark/>
+          </w:tcPr>
+          <w:p>
+            <w:pPr>
+              <w:bidi/>
+              <w:rPr>
+                <w:lang w:val="en-IL"/>
+              </w:rPr>
+            </w:pPr>
+            <w:r>
+              <w:rPr>
+                <w:lang w:val="en-IL"/>
+              </w:rPr>
+              <w:t>32772-&gt;8080, 32773-&gt;8081</w:t>
+            </w:r>
+          </w:p>
+        </w:tc>
+      </w:tr>
+      <w:tr>
+        <w:trPr>
+          <w:tblCellSpacing w:w="15" w:type="dxa"/>
+        </w:trPr>
+        <w:tc>
+          <w:tcPr>
+            <w:tcW w:w="0" w:type="auto"/>
+            <w:vAlign w:val="center"/>
+            <w:hideMark/>
+          </w:tcPr>
+          <w:p>
+            <w:pPr>
+              <w:bidi/>
+              <w:rPr>
+                <w:lang w:val="en-IL"/>
+              </w:rPr>
+            </w:pPr>
+            <w:r>
+              <w:rPr>
+                <w:rtl/>
+              </w:rPr>
+              <w:t>יצירת קונטיינר</w:t>
+            </w:r>
+          </w:p>
+        </w:tc>
+        <w:tc>
+          <w:tcPr>
+            <w:tcW w:w="0" w:type="auto"/>
+            <w:vAlign w:val="center"/>
+            <w:hideMark/>
+          </w:tcPr>
+          <w:p>
+            <w:pPr>
+              <w:bidi/>
+              <w:rPr>
+                <w:lang w:val="en-IL"/>
+              </w:rPr>
+            </w:pPr>
+            <w:r>
+              <w:rPr>
+                <w:rtl/>
+              </w:rPr>
+              <w:t xml:space="preserve">דרך </w:t>
+            </w:r>
+            <w:r>
+              <w:rPr>
+                <w:lang w:val="en-IL"/>
+              </w:rPr>
+              <w:t>docker-compose up</w:t>
+            </w:r>
+          </w:p>
+        </w:tc>
+        <w:tc>
+          <w:tcPr>
+            <w:tcW w:w="0" w:type="auto"/>
+            <w:vAlign w:val="center"/>
+            <w:hideMark/>
+          </w:tcPr>
+          <w:p>
+            <w:pPr>
+              <w:bidi/>
+              <w:rPr>
+                <w:lang w:val="en-IL"/>
+              </w:rPr>
+            </w:pPr>
+            <w:r>
+              <w:rPr>
+                <w:rtl/>
+              </w:rPr>
+              <w:t>כנראה נבנה/הריץ מחוץ ל־</w:t>
+            </w:r>
+            <w:r>
+              <w:rPr>
+                <w:lang w:val="en-IL"/>
+              </w:rPr>
+              <w:t xml:space="preserve">compose </w:t>
+            </w:r>
+            <w:r>
+              <w:rPr>
+                <w:rtl/>
+              </w:rPr>
+              <w:t>או לפני שינויים</w:t>
+            </w:r>
+          </w:p>
+        </w:tc>
+      </w:tr>
+    </w:tbl>
     <w:p>
       <w:pPr>
         <w:bidi/>
         <w:rPr>
           <w:rtl/>
+        </w:rPr>
+      </w:pPr>
+    </w:p>
+    <w:p>
+      <w:pPr>
+        <w:bidi/>
+        <w:rPr>
+          <w:rtl/>
+          <w:lang w:val="en-IL"/>
+        </w:rPr>
+      </w:pPr>
+      <w:r>
+        <w:rPr>
+          <w:rFonts w:cs="Arial"/>
+          <w:rtl/>
+          <w:lang w:val="en-IL"/>
+        </w:rPr>
+        <w:drawing>
+          <wp:inline distT="0" distB="0" distL="0" distR="0" wp14:anchorId="733B0FAF" wp14:editId="69B88823">
+            <wp:extent cx="6518453" cy="1582310"/>
+            <wp:effectExtent l="0" t="0" r="0" b="0"/>
+            <wp:docPr id="2095222206" name="Picture 1" descr="A white background with black text&#10;&#10;AI-generated content may be incorrect."/>
+            <wp:cNvGraphicFramePr>
+              <a:graphicFrameLocks xmlns:a="http://schemas.openxmlformats.org/drawingml/2006/main" noChangeAspect="1"/>
+            </wp:cNvGraphicFramePr>
+            <a:graphic xmlns:a="http://schemas.openxmlformats.org/drawingml/2006/main">
+              <a:graphicData uri="http://schemas.openxmlformats.org/drawingml/2006/picture">
+                <pic:pic xmlns:pic="http://schemas.openxmlformats.org/drawingml/2006/picture">
+                  <pic:nvPicPr>
+                    <pic:cNvPr id="2095222206" name="Picture 1" descr="A white background with black text&#10;&#10;AI-generated content may be incorrect."/>
+                    <pic:cNvPicPr/>
+                  </pic:nvPicPr>
+                  <pic:blipFill>
+                    <a:blip r:embed="rId6"/>
+                    <a:stretch>
+                      <a:fillRect/>
+                    </a:stretch>
+                  </pic:blipFill>
+                  <pic:spPr>
+                    <a:xfrm>
+                      <a:off x="0" y="0"/>
+                      <a:ext cx="6537821" cy="1587012"/>
+                    </a:xfrm>
+                    <a:prstGeom prst="rect">
+                      <a:avLst/>
+                    </a:prstGeom>
+                  </pic:spPr>
+                </pic:pic>
+              </a:graphicData>
+            </a:graphic>
+          </wp:inline>
+        </w:drawing>
+      </w:r>
+    </w:p>
+    <w:p>
+      <w:pPr>
+        <w:bidi/>
+        <w:rPr>
+          <w:b/>
+          <w:bCs/>
+          <w:lang w:val="en-IL"/>
+        </w:rPr>
+      </w:pPr>
+      <w:r>
+        <w:rPr>
+          <w:b/>
+          <w:bCs/>
+          <w:rtl/>
+          <w:lang w:val="en-IL"/>
+        </w:rPr>
+        <w:t>מסקנות חשובות</w:t>
+      </w:r>
+    </w:p>
+    <w:p>
+      <w:pPr>
+        <w:numPr>
+          <w:ilvl w:val="0"/>
+          <w:numId w:val="21"/>
+        </w:numPr>
+        <w:bidi/>
+        <w:rPr>
+          <w:lang w:val="en-IL"/>
+        </w:rPr>
+      </w:pPr>
+      <w:r>
+        <w:rPr>
+          <w:b/>
+          <w:bCs/>
+          <w:rtl/>
+          <w:lang w:val="en-IL"/>
+        </w:rPr>
+        <w:t>אם אתה מריץ הקליינט מחוץ לדוקר</w:t>
+      </w:r>
+      <w:r>
+        <w:rPr>
+          <w:rtl/>
+          <w:lang w:val="en-IL"/>
+        </w:rPr>
+        <w:t xml:space="preserve"> </w:t>
+      </w:r>
+      <w:r>
+        <w:rPr>
+          <w:lang w:val="en-IL"/>
+        </w:rPr>
+        <w:t>(</w:t>
+      </w:r>
+      <w:r>
+        <w:rPr>
+          <w:rtl/>
+          <w:lang w:val="en-IL"/>
+        </w:rPr>
+        <w:t xml:space="preserve">למשל </w:t>
+      </w:r>
+      <w:proofErr w:type="spellStart"/>
+      <w:r>
+        <w:rPr>
+          <w:lang w:val="en-IL"/>
+        </w:rPr>
+        <w:t>npm</w:t>
+      </w:r>
+      <w:proofErr w:type="spellEnd"/>
+      <w:r>
+        <w:rPr>
+          <w:lang w:val="en-IL"/>
+        </w:rPr>
+        <w:t xml:space="preserve"> start):</w:t>
+      </w:r>
+    </w:p>
+    <w:p>
+      <w:pPr>
+        <w:numPr>
+          <w:ilvl w:val="1"/>
+          <w:numId w:val="21"/>
+        </w:numPr>
+        <w:bidi/>
+        <w:rPr>
+          <w:lang w:val="en-IL"/>
+        </w:rPr>
+      </w:pPr>
+      <w:r>
+        <w:rPr>
+          <w:rtl/>
+          <w:lang w:val="en-IL"/>
+        </w:rPr>
+        <w:t>ה</w:t>
+      </w:r>
+      <w:r>
+        <w:rPr>
+          <w:rtl/>
+          <w:lang w:val="en-IL"/>
+        </w:rPr>
+        <w:noBreakHyphen/>
+      </w:r>
+      <w:r>
+        <w:rPr>
+          <w:lang w:val="en-IL"/>
+        </w:rPr>
+        <w:t xml:space="preserve">REACT_APP_API_BASE_URL </w:t>
+      </w:r>
+      <w:r>
+        <w:rPr>
+          <w:rtl/>
+          <w:lang w:val="en-IL"/>
+        </w:rPr>
+        <w:t xml:space="preserve">צריך להיות </w:t>
+      </w:r>
+      <w:r>
+        <w:rPr>
+          <w:lang w:val="en-IL"/>
+        </w:rPr>
+        <w:t xml:space="preserve">http://localhost:32774 </w:t>
+      </w:r>
+      <w:r>
+        <w:rPr>
+          <w:rtl/>
+          <w:lang w:val="en-IL"/>
+        </w:rPr>
+        <w:t>אם אתה רוצה להתחבר ל־</w:t>
+      </w:r>
+      <w:r>
+        <w:rPr>
+          <w:lang w:val="en-IL"/>
+        </w:rPr>
+        <w:t xml:space="preserve">API </w:t>
+      </w:r>
+      <w:r>
+        <w:rPr>
+          <w:rtl/>
+          <w:lang w:val="en-IL"/>
+        </w:rPr>
+        <w:t>שהרצת עם</w:t>
+      </w:r>
+      <w:r>
+        <w:rPr>
+          <w:lang w:val="en-IL"/>
+        </w:rPr>
+        <w:t xml:space="preserve"> Docker Compose (a2c-api-1).</w:t>
+      </w:r>
+    </w:p>
+    <w:p>
+      <w:pPr>
+        <w:numPr>
+          <w:ilvl w:val="1"/>
+          <w:numId w:val="21"/>
+        </w:numPr>
+        <w:bidi/>
+        <w:rPr>
+          <w:lang w:val="en-IL"/>
+        </w:rPr>
+      </w:pPr>
+      <w:r>
+        <w:rPr>
+          <w:rtl/>
+          <w:lang w:val="en-IL"/>
+        </w:rPr>
+        <w:t>אם אתה רוצה להתחבר ל־</w:t>
+      </w:r>
+      <w:r>
+        <w:rPr>
+          <w:lang w:val="en-IL"/>
+        </w:rPr>
+        <w:t xml:space="preserve">API </w:t>
+      </w:r>
+      <w:r>
+        <w:rPr>
+          <w:rtl/>
+          <w:lang w:val="en-IL"/>
+        </w:rPr>
+        <w:t>שה־</w:t>
+      </w:r>
+      <w:r>
+        <w:rPr>
+          <w:lang w:val="en-IL"/>
+        </w:rPr>
+        <w:t xml:space="preserve">VS </w:t>
+      </w:r>
+      <w:r>
+        <w:rPr>
+          <w:rtl/>
+          <w:lang w:val="en-IL"/>
+        </w:rPr>
+        <w:t>הריץ</w:t>
+      </w:r>
+      <w:r>
+        <w:rPr>
+          <w:lang w:val="en-IL"/>
+        </w:rPr>
+        <w:t xml:space="preserve"> (AuthService_1), </w:t>
+      </w:r>
+      <w:r>
+        <w:rPr>
+          <w:rtl/>
+          <w:lang w:val="en-IL"/>
+        </w:rPr>
+        <w:t>אז צריך להשתמש ב־</w:t>
+      </w:r>
+      <w:r>
+        <w:rPr>
+          <w:lang w:val="en-IL"/>
+        </w:rPr>
+        <w:t>http://localhost:32779.</w:t>
+      </w:r>
+    </w:p>
+    <w:p>
+      <w:pPr>
+        <w:numPr>
+          <w:ilvl w:val="0"/>
+          <w:numId w:val="21"/>
+        </w:numPr>
+        <w:bidi/>
+        <w:rPr>
+          <w:lang w:val="en-IL"/>
+        </w:rPr>
+      </w:pPr>
+      <w:r>
+        <w:rPr>
+          <w:b/>
+          <w:bCs/>
+          <w:rtl/>
+          <w:lang w:val="en-IL"/>
+        </w:rPr>
+        <w:t>אם אתה מריץ את הקליינט בתוך</w:t>
+      </w:r>
+      <w:r>
+        <w:rPr>
+          <w:b/>
+          <w:bCs/>
+          <w:lang w:val="en-IL"/>
+        </w:rPr>
+        <w:t xml:space="preserve"> Docker Compose</w:t>
+      </w:r>
+      <w:r>
+        <w:rPr>
+          <w:lang w:val="en-IL"/>
+        </w:rPr>
+        <w:t>:</w:t>
+      </w:r>
+    </w:p>
+    <w:p>
+      <w:pPr>
+        <w:numPr>
+          <w:ilvl w:val="1"/>
+          <w:numId w:val="21"/>
+        </w:numPr>
+        <w:bidi/>
+        <w:rPr>
+          <w:lang w:val="en-IL"/>
+        </w:rPr>
+      </w:pPr>
+      <w:r>
+        <w:rPr>
+          <w:rtl/>
+          <w:lang w:val="en-IL"/>
+        </w:rPr>
+        <w:lastRenderedPageBreak/>
+        <w:t>בתוך הרשת של</w:t>
+      </w:r>
+      <w:r>
+        <w:rPr>
+          <w:lang w:val="en-IL"/>
+        </w:rPr>
+        <w:t xml:space="preserve"> Docker (a2cnet), </w:t>
+      </w:r>
+      <w:r>
+        <w:rPr>
+          <w:rtl/>
+          <w:lang w:val="en-IL"/>
+        </w:rPr>
+        <w:t>הקליינט יכול לפנות ל־</w:t>
+      </w:r>
+      <w:r>
+        <w:rPr>
+          <w:lang w:val="en-IL"/>
+        </w:rPr>
+        <w:t xml:space="preserve">API </w:t>
+      </w:r>
+      <w:r>
+        <w:rPr>
+          <w:rtl/>
+          <w:lang w:val="en-IL"/>
+        </w:rPr>
+        <w:t>לפי שם השירות</w:t>
+      </w:r>
+      <w:r>
+        <w:rPr>
+          <w:lang w:val="en-IL"/>
+        </w:rPr>
+        <w:t>: http://api:8080 (</w:t>
+      </w:r>
+      <w:r>
+        <w:rPr>
+          <w:rtl/>
+          <w:lang w:val="en-IL"/>
+        </w:rPr>
+        <w:t>כי</w:t>
+      </w:r>
+      <w:r>
+        <w:rPr>
+          <w:lang w:val="en-IL"/>
+        </w:rPr>
+        <w:t xml:space="preserve"> Docker </w:t>
+      </w:r>
+      <w:r>
+        <w:rPr>
+          <w:rtl/>
+          <w:lang w:val="en-IL"/>
+        </w:rPr>
+        <w:t xml:space="preserve">יודע לפתור את השם </w:t>
+      </w:r>
+      <w:proofErr w:type="spellStart"/>
+      <w:r>
+        <w:rPr>
+          <w:lang w:val="en-IL"/>
+        </w:rPr>
+        <w:t>api</w:t>
+      </w:r>
+      <w:proofErr w:type="spellEnd"/>
+      <w:r>
+        <w:rPr>
+          <w:lang w:val="en-IL"/>
+        </w:rPr>
+        <w:t xml:space="preserve"> </w:t>
+      </w:r>
+      <w:r>
+        <w:rPr>
+          <w:rtl/>
+          <w:lang w:val="en-IL"/>
+        </w:rPr>
+        <w:t>לשירות בתוך הרשת</w:t>
+      </w:r>
+      <w:r>
+        <w:rPr>
+          <w:lang w:val="en-IL"/>
+        </w:rPr>
+        <w:t>).</w:t>
+      </w:r>
+    </w:p>
+    <w:p>
+      <w:pPr>
+        <w:numPr>
+          <w:ilvl w:val="0"/>
+          <w:numId w:val="21"/>
+        </w:numPr>
+        <w:bidi/>
+        <w:rPr>
+          <w:lang w:val="en-IL"/>
+        </w:rPr>
+      </w:pPr>
+      <w:r>
+        <w:rPr>
+          <w:b/>
+          <w:bCs/>
+          <w:lang w:val="en-IL"/>
+        </w:rPr>
+        <w:t>CORS</w:t>
+      </w:r>
+      <w:r>
+        <w:rPr>
+          <w:lang w:val="en-IL"/>
+        </w:rPr>
+        <w:t>:</w:t>
+      </w:r>
+    </w:p>
+    <w:p>
+      <w:pPr>
+        <w:numPr>
+          <w:ilvl w:val="1"/>
+          <w:numId w:val="21"/>
+        </w:numPr>
+        <w:bidi/>
+        <w:rPr>
+          <w:lang w:val="en-IL"/>
+        </w:rPr>
+      </w:pPr>
+      <w:r>
+        <w:rPr>
+          <w:rtl/>
+          <w:lang w:val="en-IL"/>
+        </w:rPr>
+        <w:t>אם הקליינט רץ מחוץ לדוקר</w:t>
+      </w:r>
+      <w:r>
+        <w:rPr>
+          <w:lang w:val="en-IL"/>
+        </w:rPr>
+        <w:t xml:space="preserve"> (localhost:3000), </w:t>
+      </w:r>
+      <w:r>
+        <w:rPr>
+          <w:rtl/>
+          <w:lang w:val="en-IL"/>
+        </w:rPr>
+        <w:t>יש לוודא שב־</w:t>
+      </w:r>
+      <w:r>
+        <w:rPr>
+          <w:lang w:val="en-IL"/>
+        </w:rPr>
+        <w:t xml:space="preserve">API </w:t>
+      </w:r>
+      <w:r>
+        <w:rPr>
+          <w:rtl/>
+          <w:lang w:val="en-IL"/>
+        </w:rPr>
+        <w:t>מוגדרת מדיניות</w:t>
+      </w:r>
+      <w:r>
+        <w:rPr>
+          <w:lang w:val="en-IL"/>
+        </w:rPr>
+        <w:t xml:space="preserve"> CORS </w:t>
+      </w:r>
+      <w:r>
+        <w:rPr>
+          <w:rtl/>
+          <w:lang w:val="en-IL"/>
+        </w:rPr>
+        <w:t xml:space="preserve">שמאפשרת </w:t>
+      </w:r>
+      <w:r>
+        <w:rPr>
+          <w:lang w:val="en-IL"/>
+        </w:rPr>
+        <w:t>http://localhost:3000.</w:t>
+      </w:r>
+    </w:p>
+    <w:p>
+      <w:pPr>
+        <w:numPr>
+          <w:ilvl w:val="1"/>
+          <w:numId w:val="21"/>
+        </w:numPr>
+        <w:bidi/>
+        <w:rPr>
+          <w:lang w:val="en-IL"/>
+        </w:rPr>
+      </w:pPr>
+      <w:r>
+        <w:rPr>
+          <w:rtl/>
+          <w:lang w:val="en-IL"/>
+        </w:rPr>
+        <w:t>אם הקליינט רץ בתוך</w:t>
+      </w:r>
+      <w:r>
+        <w:rPr>
+          <w:lang w:val="en-IL"/>
+        </w:rPr>
+        <w:t xml:space="preserve"> Docker Compose, </w:t>
+      </w:r>
+      <w:r>
+        <w:rPr>
+          <w:rtl/>
+          <w:lang w:val="en-IL"/>
+        </w:rPr>
+        <w:t>ה</w:t>
+      </w:r>
+      <w:r>
+        <w:rPr>
+          <w:lang w:val="en-IL"/>
+        </w:rPr>
+        <w:t xml:space="preserve">-CORS </w:t>
+      </w:r>
+      <w:r>
+        <w:rPr>
+          <w:rtl/>
+          <w:lang w:val="en-IL"/>
+        </w:rPr>
+        <w:t xml:space="preserve">צריך להתאים לשם השירות של הלקוח (למשל </w:t>
+      </w:r>
+      <w:r>
+        <w:rPr>
+          <w:lang w:val="en-IL"/>
+        </w:rPr>
+        <w:t>http://client:80).</w:t>
+      </w:r>
+    </w:p>
+    <w:p>
+      <w:pPr>
+        <w:bidi/>
+        <w:rPr>
+          <w:rtl/>
+          <w:lang w:val="en-IL"/>
         </w:rPr>
       </w:pPr>
     </w:p>
@@ -8861,6 +9898,123 @@
     </w:lvl>
   </w:abstractNum>
   <w:abstractNum w:abstractNumId="6" w15:restartNumberingAfterBreak="0">
+    <w:nsid w:val="2DF54AA7"/>
+    <w:multiLevelType w:val="multilevel"/>
+    <w:tmpl w:val="786C4016"/>
+    <w:lvl w:ilvl="0">
+      <w:start w:val="1"/>
+      <w:numFmt w:val="decimal"/>
+      <w:lvlText w:val="%1."/>
+      <w:lvlJc w:val="left"/>
+      <w:pPr>
+        <w:tabs>
+          <w:tab w:val="num" w:pos="720"/>
+        </w:tabs>
+        <w:ind w:left="720" w:hanging="360"/>
+      </w:pPr>
+    </w:lvl>
+    <w:lvl w:ilvl="1">
+      <w:start w:val="1"/>
+      <w:numFmt w:val="bullet"/>
+      <w:lvlText w:val="o"/>
+      <w:lvlJc w:val="left"/>
+      <w:pPr>
+        <w:tabs>
+          <w:tab w:val="num" w:pos="1440"/>
+        </w:tabs>
+        <w:ind w:left="1440" w:hanging="360"/>
+      </w:pPr>
+      <w:rPr>
+        <w:rFonts w:ascii="Courier New" w:hAnsi="Courier New" w:hint="default"/>
+        <w:sz w:val="20"/>
+      </w:rPr>
+    </w:lvl>
+    <w:lvl w:ilvl="2" w:tentative="1">
+      <w:start w:val="1"/>
+      <w:numFmt w:val="decimal"/>
+      <w:lvlText w:val="%3."/>
+      <w:lvlJc w:val="left"/>
+      <w:pPr>
+        <w:tabs>
+          <w:tab w:val="num" w:pos="2160"/>
+        </w:tabs>
+        <w:ind w:left="2160" w:hanging="360"/>
+      </w:pPr>
+    </w:lvl>
+    <w:lvl w:ilvl="3" w:tentative="1">
+      <w:start w:val="1"/>
+      <w:numFmt w:val="decimal"/>
+      <w:lvlText w:val="%4."/>
+      <w:lvlJc w:val="left"/>
+      <w:pPr>
+        <w:tabs>
+          <w:tab w:val="num" w:pos="2880"/>
+        </w:tabs>
+        <w:ind w:left="2880" w:hanging="360"/>
+      </w:pPr>
+    </w:lvl>
+    <w:lvl w:ilvl="4" w:tentative="1">
+      <w:start w:val="1"/>
+      <w:numFmt w:val="decimal"/>
+      <w:lvlText w:val="%5."/>
+      <w:lvlJc w:val="left"/>
+      <w:pPr>
+        <w:tabs>
+          <w:tab w:val="num" w:pos="3600"/>
+        </w:tabs>
+        <w:ind w:left="3600" w:hanging="360"/>
+      </w:pPr>
+    </w:lvl>
+    <w:lvl w:ilvl="5" w:tentative="1">
+      <w:start w:val="1"/>
+      <w:numFmt w:val="decimal"/>
+      <w:lvlText w:val="%6."/>
+      <w:lvlJc w:val="left"/>
+      <w:pPr>
+        <w:tabs>
+          <w:tab w:val="num" w:pos="4320"/>
+        </w:tabs>
+        <w:ind w:left="4320" w:hanging="360"/>
+      </w:pPr>
+    </w:lvl>
+    <w:lvl w:ilvl="6" w:tentative="1">
+      <w:start w:val="1"/>
+      <w:numFmt w:val="decimal"/>
+      <w:lvlText w:val="%7."/>
+      <w:lvlJc w:val="left"/>
+      <w:pPr>
+        <w:tabs>
+          <w:tab w:val="num" w:pos="5040"/>
+        </w:tabs>
+        <w:ind w:left="5040" w:hanging="360"/>
+      </w:pPr>
+    </w:lvl>
+    <w:lvl w:ilvl="7" w:tentative="1">
+      <w:start w:val="1"/>
+      <w:numFmt w:val="decimal"/>
+      <w:lvlText w:val="%8."/>
+      <w:lvlJc w:val="left"/>
+      <w:pPr>
+        <w:tabs>
+          <w:tab w:val="num" w:pos="5760"/>
+        </w:tabs>
+        <w:ind w:left="5760" w:hanging="360"/>
+      </w:pPr>
+    </w:lvl>
+    <w:lvl w:ilvl="8" w:tentative="1">
+      <w:start w:val="1"/>
+      <w:numFmt w:val="decimal"/>
+      <w:lvlText w:val="%9."/>
+      <w:lvlJc w:val="left"/>
+      <w:pPr>
+        <w:tabs>
+          <w:tab w:val="num" w:pos="6480"/>
+        </w:tabs>
+        <w:ind w:left="6480" w:hanging="360"/>
+      </w:pPr>
+    </w:lvl>
+  </w:abstractNum>
+  <w:abstractNum w:abstractNumId="7" w15:restartNumberingAfterBreak="0">
     <w:nsid w:val="2FF877E5"/>
     <w:multiLevelType w:val="multilevel"/>
     <w:tmpl w:val="BC4A02AE"/>
@@ -9009,7 +10163,7 @@
       </w:rPr>
     </w:lvl>
   </w:abstractNum>
-  <w:abstractNum w:abstractNumId="7" w15:restartNumberingAfterBreak="0">
+  <w:abstractNum w:abstractNumId="8" w15:restartNumberingAfterBreak="0">
     <w:nsid w:val="32B058C3"/>
     <w:multiLevelType w:val="hybridMultilevel"/>
     <w:tmpl w:val="FCC0047A"/>
@@ -9122,7 +10276,7 @@
       </w:rPr>
     </w:lvl>
   </w:abstractNum>
-  <w:abstractNum w:abstractNumId="8" w15:restartNumberingAfterBreak="0">
+  <w:abstractNum w:abstractNumId="9" w15:restartNumberingAfterBreak="0">
     <w:nsid w:val="387D5901"/>
     <w:multiLevelType w:val="multilevel"/>
     <w:tmpl w:val="AD424262"/>
@@ -9271,7 +10425,7 @@
       </w:rPr>
     </w:lvl>
   </w:abstractNum>
-  <w:abstractNum w:abstractNumId="9" w15:restartNumberingAfterBreak="0">
+  <w:abstractNum w:abstractNumId="10" w15:restartNumberingAfterBreak="0">
     <w:nsid w:val="470F4BFA"/>
     <w:multiLevelType w:val="multilevel"/>
     <w:tmpl w:val="1916AE32"/>
@@ -9420,7 +10574,7 @@
       </w:rPr>
     </w:lvl>
   </w:abstractNum>
-  <w:abstractNum w:abstractNumId="10" w15:restartNumberingAfterBreak="0">
+  <w:abstractNum w:abstractNumId="11" w15:restartNumberingAfterBreak="0">
     <w:nsid w:val="49336454"/>
     <w:multiLevelType w:val="multilevel"/>
     <w:tmpl w:val="6FB03C56"/>
@@ -9533,7 +10687,7 @@
       </w:pPr>
     </w:lvl>
   </w:abstractNum>
-  <w:abstractNum w:abstractNumId="11" w15:restartNumberingAfterBreak="0">
+  <w:abstractNum w:abstractNumId="12" w15:restartNumberingAfterBreak="0">
     <w:nsid w:val="4E7351E6"/>
     <w:multiLevelType w:val="multilevel"/>
     <w:tmpl w:val="6CD8364C"/>
@@ -9682,7 +10836,7 @@
       </w:rPr>
     </w:lvl>
   </w:abstractNum>
-  <w:abstractNum w:abstractNumId="12" w15:restartNumberingAfterBreak="0">
+  <w:abstractNum w:abstractNumId="13" w15:restartNumberingAfterBreak="0">
     <w:nsid w:val="55AB449D"/>
     <w:multiLevelType w:val="multilevel"/>
     <w:tmpl w:val="16C62B9E"/>
@@ -9795,7 +10949,7 @@
       </w:pPr>
     </w:lvl>
   </w:abstractNum>
-  <w:abstractNum w:abstractNumId="13" w15:restartNumberingAfterBreak="0">
+  <w:abstractNum w:abstractNumId="14" w15:restartNumberingAfterBreak="0">
     <w:nsid w:val="59C8297E"/>
     <w:multiLevelType w:val="multilevel"/>
     <w:tmpl w:val="F5508990"/>
@@ -9944,7 +11098,7 @@
       </w:rPr>
     </w:lvl>
   </w:abstractNum>
-  <w:abstractNum w:abstractNumId="14" w15:restartNumberingAfterBreak="0">
+  <w:abstractNum w:abstractNumId="15" w15:restartNumberingAfterBreak="0">
     <w:nsid w:val="67CF4480"/>
     <w:multiLevelType w:val="multilevel"/>
     <w:tmpl w:val="3EDE590C"/>
@@ -10093,7 +11247,7 @@
       </w:rPr>
     </w:lvl>
   </w:abstractNum>
-  <w:abstractNum w:abstractNumId="15" w15:restartNumberingAfterBreak="0">
+  <w:abstractNum w:abstractNumId="16" w15:restartNumberingAfterBreak="0">
     <w:nsid w:val="6A1F7185"/>
     <w:multiLevelType w:val="multilevel"/>
     <w:tmpl w:val="9E525B34"/>
@@ -10242,7 +11396,7 @@
       </w:rPr>
     </w:lvl>
   </w:abstractNum>
-  <w:abstractNum w:abstractNumId="16" w15:restartNumberingAfterBreak="0">
+  <w:abstractNum w:abstractNumId="17" w15:restartNumberingAfterBreak="0">
     <w:nsid w:val="72237BD1"/>
     <w:multiLevelType w:val="multilevel"/>
     <w:tmpl w:val="B144F344"/>
@@ -10355,7 +11509,7 @@
       </w:pPr>
     </w:lvl>
   </w:abstractNum>
-  <w:abstractNum w:abstractNumId="17" w15:restartNumberingAfterBreak="0">
+  <w:abstractNum w:abstractNumId="18" w15:restartNumberingAfterBreak="0">
     <w:nsid w:val="7BE9671A"/>
     <w:multiLevelType w:val="multilevel"/>
     <w:tmpl w:val="5E821FEE"/>
@@ -10504,7 +11658,7 @@
       </w:rPr>
     </w:lvl>
   </w:abstractNum>
-  <w:abstractNum w:abstractNumId="18" w15:restartNumberingAfterBreak="0">
+  <w:abstractNum w:abstractNumId="19" w15:restartNumberingAfterBreak="0">
     <w:nsid w:val="7C5A5716"/>
     <w:multiLevelType w:val="multilevel"/>
     <w:tmpl w:val="46626FBA"/>
@@ -10653,7 +11807,7 @@
       </w:rPr>
     </w:lvl>
   </w:abstractNum>
-  <w:abstractNum w:abstractNumId="19" w15:restartNumberingAfterBreak="0">
+  <w:abstractNum w:abstractNumId="20" w15:restartNumberingAfterBreak="0">
     <w:nsid w:val="7F7F0B8E"/>
     <w:multiLevelType w:val="hybridMultilevel"/>
     <w:tmpl w:val="04521E1C"/>
@@ -10767,43 +11921,43 @@
     </w:lvl>
   </w:abstractNum>
   <w:num w:numId="1" w16cid:durableId="1922639782">
-    <w:abstractNumId w:val="7"/>
+    <w:abstractNumId w:val="8"/>
   </w:num>
   <w:num w:numId="2" w16cid:durableId="919288310">
     <w:abstractNumId w:val="1"/>
   </w:num>
   <w:num w:numId="3" w16cid:durableId="2113278963">
-    <w:abstractNumId w:val="13"/>
+    <w:abstractNumId w:val="14"/>
   </w:num>
   <w:num w:numId="4" w16cid:durableId="763651920">
-    <w:abstractNumId w:val="15"/>
+    <w:abstractNumId w:val="16"/>
   </w:num>
   <w:num w:numId="5" w16cid:durableId="745424166">
-    <w:abstractNumId w:val="11"/>
+    <w:abstractNumId w:val="12"/>
   </w:num>
   <w:num w:numId="6" w16cid:durableId="13457703">
-    <w:abstractNumId w:val="8"/>
+    <w:abstractNumId w:val="9"/>
   </w:num>
   <w:num w:numId="7" w16cid:durableId="70394628">
-    <w:abstractNumId w:val="19"/>
+    <w:abstractNumId w:val="20"/>
   </w:num>
   <w:num w:numId="8" w16cid:durableId="427652855">
-    <w:abstractNumId w:val="6"/>
+    <w:abstractNumId w:val="7"/>
   </w:num>
   <w:num w:numId="9" w16cid:durableId="1517576576">
-    <w:abstractNumId w:val="14"/>
+    <w:abstractNumId w:val="15"/>
   </w:num>
   <w:num w:numId="10" w16cid:durableId="652609081">
     <w:abstractNumId w:val="5"/>
   </w:num>
   <w:num w:numId="11" w16cid:durableId="533151994">
-    <w:abstractNumId w:val="17"/>
+    <w:abstractNumId w:val="18"/>
   </w:num>
   <w:num w:numId="12" w16cid:durableId="2097823002">
-    <w:abstractNumId w:val="9"/>
+    <w:abstractNumId w:val="10"/>
   </w:num>
   <w:num w:numId="13" w16cid:durableId="1307971476">
-    <w:abstractNumId w:val="12"/>
+    <w:abstractNumId w:val="13"/>
   </w:num>
   <w:num w:numId="14" w16cid:durableId="1314026744">
     <w:abstractNumId w:val="3"/>
@@ -10815,16 +11969,19 @@
     <w:abstractNumId w:val="0"/>
   </w:num>
   <w:num w:numId="17" w16cid:durableId="391777720">
-    <w:abstractNumId w:val="16"/>
+    <w:abstractNumId w:val="17"/>
   </w:num>
   <w:num w:numId="18" w16cid:durableId="1739816707">
     <w:abstractNumId w:val="4"/>
   </w:num>
   <w:num w:numId="19" w16cid:durableId="1319579072">
-    <w:abstractNumId w:val="18"/>
+    <w:abstractNumId w:val="19"/>
   </w:num>
   <w:num w:numId="20" w16cid:durableId="550767990">
-    <w:abstractNumId w:val="10"/>
+    <w:abstractNumId w:val="11"/>
+  </w:num>
+  <w:num w:numId="21" w16cid:durableId="1799954238">
+    <w:abstractNumId w:val="6"/>
   </w:num>
 </w:numbering>
 </file>
@@ -11432,7 +12589,6 @@
   <w:style w:type="character" w:default="1" w:styleId="DefaultParagraphFont">
     <w:name w:val="Default Paragraph Font"/>
     <w:uiPriority w:val="1"/>
-    <w:semiHidden/>
     <w:unhideWhenUsed/>
   </w:style>
   <w:style w:type="table" w:default="1" w:styleId="TableNormal">

</xml_diff>